<commit_message>
Update application branding to 'Campus Voice — A College Complaint Management System' across all pages, docs, and backend
</commit_message>
<xml_diff>
--- a/CampusVoice_Project_Presentation_and_Viva_Guide.docx
+++ b/CampusVoice_Project_Presentation_and_Viva_Guide.docx
@@ -13,7 +13,7 @@
           <w:color w:val="2563EB"/>
           <w:sz w:val="52"/>
         </w:rPr>
-        <w:t>CampusVoice</w:t>
+        <w:t>Campus Voice</w:t>
       </w:r>
     </w:p>
     <w:p>
@@ -27,7 +27,7 @@
           <w:color w:val="0F172A"/>
           <w:sz w:val="30"/>
         </w:rPr>
-        <w:t>College Grievance Management System</w:t>
+        <w:t>A College Complaint Management System</w:t>
         <w:br/>
         <w:t>Complete Project Architecture, Team Division &amp; Viva Guide</w:t>
       </w:r>

</xml_diff>